<commit_message>
templates: fix the drafting problems, and use heading styles and automatic numbering
D12-C's declarations of interest now loop over the directors present
who declared one, with a new derived field resolution.interest_declared
for the no-interest confirmation, and no longer read "as X, and ." when
the director does not abstain. D1SP-B's [[...]] placeholder is a counsel
note, and D13's "Issuer" label sits above the locked wording. Spacing
around inline conditions is fixed so assembled text has no stray spaces.

Headings use Word's Heading 1 style and numbers use Word automatic
numbering, as a firm's master would. All nine templates now import and
pass the import rules. The Word files, field usage and eval notes are
regenerated or updated to match.
</commit_message>
<xml_diff>
--- a/templates/first-pass/00_Template_Pack_Guide.docx
+++ b/templates/first-pass/00_Template_Pack_Guide.docx
@@ -84,7 +84,12 @@
     </w:p>
     <w:p>
       <w:pPr>
+        <w:pStyle w:val="Heading1"/>
         <w:keepNext/>
+        <w:numPr>
+          <w:ilvl w:val="0"/>
+          <w:numId w:val="2"/>
+        </w:numPr>
         <w:spacing w:after="100" w:before="240"/>
       </w:pPr>
       <w:r>
@@ -96,7 +101,7 @@
           <w:sz w:val="23"/>
           <w:szCs w:val="23"/>
         </w:rPr>
-        <w:t xml:space="preserve">1 The templates</w:t>
+        <w:t xml:space="preserve">The templates</w:t>
       </w:r>
     </w:p>
     <w:tbl>
@@ -1078,7 +1083,12 @@
     </w:tbl>
     <w:p>
       <w:pPr>
+        <w:pStyle w:val="Heading1"/>
         <w:keepNext/>
+        <w:numPr>
+          <w:ilvl w:val="0"/>
+          <w:numId w:val="2"/>
+        </w:numPr>
         <w:spacing w:after="100" w:before="240"/>
       </w:pPr>
       <w:r>
@@ -1090,7 +1100,7 @@
           <w:sz w:val="23"/>
           <w:szCs w:val="23"/>
         </w:rPr>
-        <w:t xml:space="preserve">2 What the research changed</w:t>
+        <w:t xml:space="preserve">What the research changed</w:t>
       </w:r>
     </w:p>
     <w:p>
@@ -1112,7 +1122,7 @@
         <w:pStyle w:val="ListParagraph"/>
         <w:numPr>
           <w:ilvl w:val="0"/>
-          <w:numId w:val="2"/>
+          <w:numId w:val="3"/>
         </w:numPr>
         <w:spacing w:after="80" w:line="290"/>
       </w:pPr>
@@ -1131,7 +1141,7 @@
         <w:pStyle w:val="ListParagraph"/>
         <w:numPr>
           <w:ilvl w:val="0"/>
-          <w:numId w:val="2"/>
+          <w:numId w:val="3"/>
         </w:numPr>
         <w:spacing w:after="80" w:line="290"/>
       </w:pPr>
@@ -1150,7 +1160,7 @@
         <w:pStyle w:val="ListParagraph"/>
         <w:numPr>
           <w:ilvl w:val="0"/>
-          <w:numId w:val="2"/>
+          <w:numId w:val="3"/>
         </w:numPr>
         <w:spacing w:after="80" w:line="290"/>
       </w:pPr>
@@ -1169,7 +1179,7 @@
         <w:pStyle w:val="ListParagraph"/>
         <w:numPr>
           <w:ilvl w:val="0"/>
-          <w:numId w:val="2"/>
+          <w:numId w:val="3"/>
         </w:numPr>
         <w:spacing w:after="80" w:line="290"/>
       </w:pPr>
@@ -1188,7 +1198,7 @@
         <w:pStyle w:val="ListParagraph"/>
         <w:numPr>
           <w:ilvl w:val="0"/>
-          <w:numId w:val="2"/>
+          <w:numId w:val="3"/>
         </w:numPr>
         <w:spacing w:after="80" w:line="290"/>
       </w:pPr>
@@ -1207,7 +1217,7 @@
         <w:pStyle w:val="ListParagraph"/>
         <w:numPr>
           <w:ilvl w:val="0"/>
-          <w:numId w:val="2"/>
+          <w:numId w:val="3"/>
         </w:numPr>
         <w:spacing w:after="80" w:line="290"/>
       </w:pPr>
@@ -1223,7 +1233,12 @@
     </w:p>
     <w:p>
       <w:pPr>
+        <w:pStyle w:val="Heading1"/>
         <w:keepNext/>
+        <w:numPr>
+          <w:ilvl w:val="0"/>
+          <w:numId w:val="2"/>
+        </w:numPr>
         <w:spacing w:after="100" w:before="240"/>
       </w:pPr>
       <w:r>
@@ -1235,7 +1250,7 @@
           <w:sz w:val="23"/>
           <w:szCs w:val="23"/>
         </w:rPr>
-        <w:t xml:space="preserve">3 Condition flags</w:t>
+        <w:t xml:space="preserve">Condition flags</w:t>
       </w:r>
     </w:p>
     <w:p>
@@ -2256,6 +2271,101 @@
                 <w:sz w:val="21"/>
                 <w:szCs w:val="21"/>
               </w:rPr>
+              <w:t xml:space="preserve">resolution.interest_declared</w:t>
+            </w:r>
+          </w:p>
+        </w:tc>
+        <w:tc>
+          <w:tcPr>
+            <w:tcW w:type="dxa" w:w="4226"/>
+            <w:tcBorders>
+              <w:top w:val="single" w:color="C5CAC3" w:sz="4"/>
+              <w:left w:val="single" w:color="C5CAC3" w:sz="4"/>
+              <w:bottom w:val="single" w:color="C5CAC3" w:sz="4"/>
+              <w:right w:val="single" w:color="C5CAC3" w:sz="4"/>
+            </w:tcBorders>
+            <w:tcMar>
+              <w:top w:type="dxa" w:w="80"/>
+              <w:left w:type="dxa" w:w="120"/>
+              <w:bottom w:type="dxa" w:w="80"/>
+              <w:right w:type="dxa" w:w="120"/>
+            </w:tcMar>
+          </w:tcPr>
+          <w:p>
+            <w:pPr>
+              <w:spacing w:after="40" w:before="0"/>
+            </w:pPr>
+            <w:r>
+              <w:rPr>
+                <w:rFonts w:ascii="Georgia" w:cs="Georgia" w:eastAsia="Georgia" w:hAnsi="Georgia"/>
+                <w:color w:val="1A1F24"/>
+                <w:sz w:val="21"/>
+                <w:szCs w:val="21"/>
+              </w:rPr>
+              <w:t xml:space="preserve">Declarations of interest, or a confirmation that there are none</w:t>
+            </w:r>
+          </w:p>
+        </w:tc>
+        <w:tc>
+          <w:tcPr>
+            <w:tcW w:type="dxa" w:w="1800"/>
+            <w:tcBorders>
+              <w:top w:val="single" w:color="C5CAC3" w:sz="4"/>
+              <w:left w:val="single" w:color="C5CAC3" w:sz="4"/>
+              <w:bottom w:val="single" w:color="C5CAC3" w:sz="4"/>
+              <w:right w:val="single" w:color="C5CAC3" w:sz="4"/>
+            </w:tcBorders>
+            <w:tcMar>
+              <w:top w:type="dxa" w:w="80"/>
+              <w:left w:type="dxa" w:w="120"/>
+              <w:bottom w:type="dxa" w:w="80"/>
+              <w:right w:type="dxa" w:w="120"/>
+            </w:tcMar>
+          </w:tcPr>
+          <w:p>
+            <w:pPr>
+              <w:spacing w:after="40" w:before="0"/>
+            </w:pPr>
+            <w:r>
+              <w:rPr>
+                <w:rFonts w:ascii="Georgia" w:cs="Georgia" w:eastAsia="Georgia" w:hAnsi="Georgia"/>
+                <w:color w:val="1A1F24"/>
+                <w:sz w:val="21"/>
+                <w:szCs w:val="21"/>
+              </w:rPr>
+              <w:t xml:space="preserve">D12-C</w:t>
+            </w:r>
+          </w:p>
+        </w:tc>
+      </w:tr>
+      <w:tr>
+        <w:tc>
+          <w:tcPr>
+            <w:tcW w:type="dxa" w:w="3000"/>
+            <w:tcBorders>
+              <w:top w:val="single" w:color="C5CAC3" w:sz="4"/>
+              <w:left w:val="single" w:color="C5CAC3" w:sz="4"/>
+              <w:bottom w:val="single" w:color="C5CAC3" w:sz="4"/>
+              <w:right w:val="single" w:color="C5CAC3" w:sz="4"/>
+            </w:tcBorders>
+            <w:tcMar>
+              <w:top w:type="dxa" w:w="80"/>
+              <w:left w:type="dxa" w:w="120"/>
+              <w:bottom w:type="dxa" w:w="80"/>
+              <w:right w:type="dxa" w:w="120"/>
+            </w:tcMar>
+          </w:tcPr>
+          <w:p>
+            <w:pPr>
+              <w:spacing w:after="40" w:before="0"/>
+            </w:pPr>
+            <w:r>
+              <w:rPr>
+                <w:rFonts w:ascii="Georgia" w:cs="Georgia" w:eastAsia="Georgia" w:hAnsi="Georgia"/>
+                <w:color w:val="1A1F24"/>
+                <w:sz w:val="21"/>
+                <w:szCs w:val="21"/>
+              </w:rPr>
               <w:t xml:space="preserve">investor.type</w:t>
             </w:r>
           </w:p>
@@ -2516,7 +2626,12 @@
     </w:tbl>
     <w:p>
       <w:pPr>
+        <w:pStyle w:val="Heading1"/>
         <w:keepNext/>
+        <w:numPr>
+          <w:ilvl w:val="0"/>
+          <w:numId w:val="2"/>
+        </w:numPr>
         <w:spacing w:after="100" w:before="240"/>
       </w:pPr>
       <w:r>
@@ -2528,7 +2643,7 @@
           <w:sz w:val="23"/>
           <w:szCs w:val="23"/>
         </w:rPr>
-        <w:t xml:space="preserve">4 Field dictionary</w:t>
+        <w:t xml:space="preserve">Field dictionary</w:t>
       </w:r>
     </w:p>
     <w:p>
@@ -16312,7 +16427,12 @@
     </w:tbl>
     <w:p>
       <w:pPr>
+        <w:pStyle w:val="Heading1"/>
         <w:keepNext/>
+        <w:numPr>
+          <w:ilvl w:val="0"/>
+          <w:numId w:val="2"/>
+        </w:numPr>
         <w:spacing w:after="100" w:before="240"/>
       </w:pPr>
       <w:r>
@@ -16324,7 +16444,7 @@
           <w:sz w:val="23"/>
           <w:szCs w:val="23"/>
         </w:rPr>
-        <w:t xml:space="preserve">5 Suggested order for counsel review</w:t>
+        <w:t xml:space="preserve">Suggested order for counsel review</w:t>
       </w:r>
     </w:p>
     <w:p>
@@ -16332,7 +16452,7 @@
         <w:pStyle w:val="ListParagraph"/>
         <w:numPr>
           <w:ilvl w:val="0"/>
-          <w:numId w:val="2"/>
+          <w:numId w:val="3"/>
         </w:numPr>
         <w:spacing w:after="80" w:line="290"/>
       </w:pPr>
@@ -16351,7 +16471,7 @@
         <w:pStyle w:val="ListParagraph"/>
         <w:numPr>
           <w:ilvl w:val="0"/>
-          <w:numId w:val="2"/>
+          <w:numId w:val="3"/>
         </w:numPr>
         <w:spacing w:after="80" w:line="290"/>
       </w:pPr>
@@ -16370,7 +16490,7 @@
         <w:pStyle w:val="ListParagraph"/>
         <w:numPr>
           <w:ilvl w:val="0"/>
-          <w:numId w:val="2"/>
+          <w:numId w:val="3"/>
         </w:numPr>
         <w:spacing w:after="80" w:line="290"/>
       </w:pPr>
@@ -16386,6 +16506,7 @@
     </w:p>
     <w:p>
       <w:pPr>
+        <w:pStyle w:val="Heading1"/>
         <w:keepNext/>
         <w:spacing w:after="100" w:before="240"/>
       </w:pPr>
@@ -16406,7 +16527,7 @@
         <w:pStyle w:val="ListParagraph"/>
         <w:numPr>
           <w:ilvl w:val="0"/>
-          <w:numId w:val="2"/>
+          <w:numId w:val="3"/>
         </w:numPr>
         <w:spacing w:after="80" w:line="290"/>
       </w:pPr>
@@ -16425,7 +16546,7 @@
         <w:pStyle w:val="ListParagraph"/>
         <w:numPr>
           <w:ilvl w:val="0"/>
-          <w:numId w:val="2"/>
+          <w:numId w:val="3"/>
         </w:numPr>
         <w:spacing w:after="80" w:line="290"/>
       </w:pPr>
@@ -16444,7 +16565,7 @@
         <w:pStyle w:val="ListParagraph"/>
         <w:numPr>
           <w:ilvl w:val="0"/>
-          <w:numId w:val="2"/>
+          <w:numId w:val="3"/>
         </w:numPr>
         <w:spacing w:after="80" w:line="290"/>
       </w:pPr>
@@ -16463,7 +16584,7 @@
         <w:pStyle w:val="ListParagraph"/>
         <w:numPr>
           <w:ilvl w:val="0"/>
-          <w:numId w:val="2"/>
+          <w:numId w:val="3"/>
         </w:numPr>
         <w:spacing w:after="80" w:line="290"/>
       </w:pPr>
@@ -16482,7 +16603,7 @@
         <w:pStyle w:val="ListParagraph"/>
         <w:numPr>
           <w:ilvl w:val="0"/>
-          <w:numId w:val="2"/>
+          <w:numId w:val="3"/>
         </w:numPr>
         <w:spacing w:after="80" w:line="290"/>
       </w:pPr>
@@ -16501,7 +16622,7 @@
         <w:pStyle w:val="ListParagraph"/>
         <w:numPr>
           <w:ilvl w:val="0"/>
-          <w:numId w:val="2"/>
+          <w:numId w:val="3"/>
         </w:numPr>
         <w:spacing w:after="80" w:line="290"/>
       </w:pPr>
@@ -16516,8 +16637,8 @@
       </w:r>
     </w:p>
     <w:sectPr>
-      <w:headerReference w:type="default" r:id="rId7"/>
-      <w:footerReference w:type="default" r:id="rId8"/>
+      <w:headerReference w:type="default" r:id="rId6"/>
+      <w:footerReference w:type="default" r:id="rId7"/>
       <w:pgSz w:w="11906" w:h="16838" w:orient="portrait"/>
       <w:pgMar w:top="1440" w:right="1440" w:bottom="1440" w:left="1440" w:header="708" w:footer="708" w:gutter="0"/>
       <w:pgNumType/>
@@ -16525,10 +16646,6 @@
     </w:sectPr>
   </w:body>
 </w:document>
-</file>
-
-<file path=word/comments.xml><?xml version="1.0" encoding="utf-8"?>
-<w:comments xmlns:cx="http://schemas.microsoft.com/office/drawing/2014/chartex" xmlns:cx1="http://schemas.microsoft.com/office/drawing/2015/9/8/chartex" xmlns:cx2="http://schemas.microsoft.com/office/drawing/2015/10/21/chartex" xmlns:cx3="http://schemas.microsoft.com/office/drawing/2016/5/9/chartex" xmlns:cx4="http://schemas.microsoft.com/office/drawing/2016/5/10/chartex" xmlns:cx5="http://schemas.microsoft.com/office/drawing/2016/5/11/chartex" xmlns:cx6="http://schemas.microsoft.com/office/drawing/2016/5/12/chartex" xmlns:cx7="http://schemas.microsoft.com/office/drawing/2016/5/13/chartex" xmlns:cx8="http://schemas.microsoft.com/office/drawing/2016/5/14/chartex" xmlns:mc="http://schemas.openxmlformats.org/markup-compatibility/2006" xmlns:aink="http://schemas.microsoft.com/office/drawing/2016/ink" xmlns:am3d="http://schemas.microsoft.com/office/drawing/2017/model3d" xmlns:o="urn:schemas-microsoft-com:office:office" xmlns:r="http://schemas.openxmlformats.org/officeDocument/2006/relationships" xmlns:m="http://schemas.openxmlformats.org/officeDocument/2006/math" xmlns:v="urn:schemas-microsoft-com:vml" xmlns:wp14="http://schemas.microsoft.com/office/word/2010/wordprocessingDrawing" xmlns:wp="http://schemas.openxmlformats.org/drawingml/2006/wordprocessingDrawing" xmlns:w10="urn:schemas-microsoft-com:office:word" xmlns:w="http://schemas.openxmlformats.org/wordprocessingml/2006/main" xmlns:w14="http://schemas.microsoft.com/office/word/2010/wordml" xmlns:w15="http://schemas.microsoft.com/office/word/2012/wordml" xmlns:w16cex="http://schemas.microsoft.com/office/word/2018/wordml/cex" xmlns:w16cid="http://schemas.microsoft.com/office/word/2016/wordml/cid" xmlns:w16="http://schemas.microsoft.com/office/word/2018/wordml" xmlns:w16sdtdh="http://schemas.microsoft.com/office/word/2020/wordml/sdtdatahash" xmlns:w16se="http://schemas.microsoft.com/office/word/2015/wordml/symex" xmlns:wpg="http://schemas.microsoft.com/office/word/2010/wordprocessingGroup" xmlns:wpi="http://schemas.microsoft.com/office/word/2010/wordprocessingInk" xmlns:wne="http://schemas.microsoft.com/office/word/2006/wordml" xmlns:wps="http://schemas.microsoft.com/office/word/2010/wordprocessingShape"/>
 </file>
 
 <file path=word/endnotes.xml><?xml version="1.0" encoding="utf-8"?>
@@ -16680,7 +16797,7 @@
 <w:numbering xmlns:wpc="http://schemas.microsoft.com/office/word/2010/wordprocessingCanvas" xmlns:mc="http://schemas.openxmlformats.org/markup-compatibility/2006" xmlns:o="urn:schemas-microsoft-com:office:office" xmlns:r="http://schemas.openxmlformats.org/officeDocument/2006/relationships" xmlns:m="http://schemas.openxmlformats.org/officeDocument/2006/math" xmlns:v="urn:schemas-microsoft-com:vml" xmlns:wp14="http://schemas.microsoft.com/office/word/2010/wordprocessingDrawing" xmlns:wp="http://schemas.openxmlformats.org/drawingml/2006/wordprocessingDrawing" xmlns:w10="urn:schemas-microsoft-com:office:word" xmlns:w="http://schemas.openxmlformats.org/wordprocessingml/2006/main" xmlns:w14="http://schemas.microsoft.com/office/word/2010/wordml" xmlns:w15="http://schemas.microsoft.com/office/word/2012/wordml" xmlns:wpg="http://schemas.microsoft.com/office/word/2010/wordprocessingGroup" xmlns:wpi="http://schemas.microsoft.com/office/word/2010/wordprocessingInk" xmlns:wne="http://schemas.microsoft.com/office/word/2006/wordml" xmlns:wps="http://schemas.microsoft.com/office/word/2010/wordprocessingShape" mc:Ignorable="w14 w15 wp14">
   <w:abstractNum w:abstractNumId="1" w15:restartNumberingAfterBreak="0">
     <w:multiLevelType w:val="hybridMultilevel"/>
-    <w:lvl w:ilvl="0" w15:tentative="1">
+    <w:lvl w:ilvl="0" w:tentative="1">
       <w:start w:val="1"/>
       <w:numFmt w:val="bullet"/>
       <w:lvlText w:val="●"/>
@@ -16689,7 +16806,7 @@
         <w:ind w:left="720" w:hanging="360"/>
       </w:pPr>
     </w:lvl>
-    <w:lvl w:ilvl="1" w15:tentative="1">
+    <w:lvl w:ilvl="1" w:tentative="1">
       <w:start w:val="1"/>
       <w:numFmt w:val="bullet"/>
       <w:lvlText w:val="○"/>
@@ -16698,7 +16815,7 @@
         <w:ind w:left="1440" w:hanging="360"/>
       </w:pPr>
     </w:lvl>
-    <w:lvl w:ilvl="2" w15:tentative="1">
+    <w:lvl w:ilvl="2" w:tentative="1">
       <w:start w:val="1"/>
       <w:numFmt w:val="bullet"/>
       <w:lvlText w:val="■"/>
@@ -16707,7 +16824,7 @@
         <w:ind w:left="2160" w:hanging="360"/>
       </w:pPr>
     </w:lvl>
-    <w:lvl w:ilvl="3" w15:tentative="1">
+    <w:lvl w:ilvl="3" w:tentative="1">
       <w:start w:val="1"/>
       <w:numFmt w:val="bullet"/>
       <w:lvlText w:val="●"/>
@@ -16716,7 +16833,7 @@
         <w:ind w:left="2880" w:hanging="360"/>
       </w:pPr>
     </w:lvl>
-    <w:lvl w:ilvl="4" w15:tentative="1">
+    <w:lvl w:ilvl="4" w:tentative="1">
       <w:start w:val="1"/>
       <w:numFmt w:val="bullet"/>
       <w:lvlText w:val="○"/>
@@ -16725,7 +16842,7 @@
         <w:ind w:left="3600" w:hanging="360"/>
       </w:pPr>
     </w:lvl>
-    <w:lvl w:ilvl="5" w15:tentative="1">
+    <w:lvl w:ilvl="5" w:tentative="1">
       <w:start w:val="1"/>
       <w:numFmt w:val="bullet"/>
       <w:lvlText w:val="■"/>
@@ -16734,7 +16851,7 @@
         <w:ind w:left="4320" w:hanging="360"/>
       </w:pPr>
     </w:lvl>
-    <w:lvl w:ilvl="6" w15:tentative="1">
+    <w:lvl w:ilvl="6" w:tentative="1">
       <w:start w:val="1"/>
       <w:numFmt w:val="bullet"/>
       <w:lvlText w:val="●"/>
@@ -16743,7 +16860,7 @@
         <w:ind w:left="5040" w:hanging="360"/>
       </w:pPr>
     </w:lvl>
-    <w:lvl w:ilvl="7" w15:tentative="1">
+    <w:lvl w:ilvl="7" w:tentative="1">
       <w:start w:val="1"/>
       <w:numFmt w:val="bullet"/>
       <w:lvlText w:val="●"/>
@@ -16752,7 +16869,7 @@
         <w:ind w:left="5760" w:hanging="360"/>
       </w:pPr>
     </w:lvl>
-    <w:lvl w:ilvl="8" w15:tentative="1">
+    <w:lvl w:ilvl="8" w:tentative="1">
       <w:start w:val="1"/>
       <w:numFmt w:val="bullet"/>
       <w:lvlText w:val="●"/>
@@ -16764,7 +16881,7 @@
   </w:abstractNum>
   <w:abstractNum w:abstractNumId="2" w15:restartNumberingAfterBreak="0">
     <w:multiLevelType w:val="hybridMultilevel"/>
-    <w:lvl w:ilvl="0" w15:tentative="1">
+    <w:lvl w:ilvl="0" w:tentative="1">
       <w:start w:val="1"/>
       <w:numFmt w:val="bullet"/>
       <w:lvlText w:val="•"/>
@@ -16776,7 +16893,7 @@
   </w:abstractNum>
   <w:abstractNum w:abstractNumId="3" w15:restartNumberingAfterBreak="0">
     <w:multiLevelType w:val="hybridMultilevel"/>
-    <w:lvl w:ilvl="0" w15:tentative="1">
+    <w:lvl w:ilvl="0" w:tentative="1">
       <w:start w:val="1"/>
       <w:numFmt w:val="decimal"/>
       <w:lvlText w:val="%1."/>
@@ -16786,6 +16903,39 @@
       </w:pPr>
     </w:lvl>
   </w:abstractNum>
+  <w:abstractNum w:abstractNumId="4" w15:restartNumberingAfterBreak="0">
+    <w:multiLevelType w:val="hybridMultilevel"/>
+    <w:lvl w:ilvl="0" w:tentative="1">
+      <w:start w:val="1"/>
+      <w:numFmt w:val="decimal"/>
+      <w:lvlText w:val="%1"/>
+      <w:lvlJc w:val="left"/>
+      <w:pPr>
+        <w:ind w:left="709" w:hanging="709"/>
+      </w:pPr>
+      <w:rPr>
+        <w:rFonts w:ascii="Georgia" w:cs="Georgia" w:eastAsia="Georgia" w:hAnsi="Georgia"/>
+        <w:b/>
+        <w:bCs/>
+        <w:sz w:val="23"/>
+        <w:szCs w:val="23"/>
+      </w:rPr>
+    </w:lvl>
+    <w:lvl w:ilvl="1" w:tentative="1">
+      <w:start w:val="1"/>
+      <w:numFmt w:val="decimal"/>
+      <w:lvlText w:val="%1.%2"/>
+      <w:lvlJc w:val="left"/>
+      <w:pPr>
+        <w:ind w:left="709" w:hanging="709"/>
+      </w:pPr>
+      <w:rPr>
+        <w:rFonts w:ascii="Georgia" w:cs="Georgia" w:eastAsia="Georgia" w:hAnsi="Georgia"/>
+        <w:sz w:val="21"/>
+        <w:szCs w:val="21"/>
+      </w:rPr>
+    </w:lvl>
+  </w:abstractNum>
   <w:num w:numId="1">
     <w:abstractNumId w:val="1"/>
     <w:lvlOverride w:ilvl="0">
@@ -16793,6 +16943,12 @@
     </w:lvlOverride>
   </w:num>
   <w:num w:numId="2">
+    <w:abstractNumId w:val="4"/>
+    <w:lvlOverride w:ilvl="0">
+      <w:startOverride w:val="1"/>
+    </w:lvlOverride>
+  </w:num>
+  <w:num w:numId="3">
     <w:abstractNumId w:val="2"/>
     <w:lvlOverride w:ilvl="0">
       <w:startOverride w:val="1"/>
@@ -16813,6 +16969,10 @@
     </w:rPrDefault>
     <w:pPrDefault/>
   </w:docDefaults>
+  <w:style w:type="paragraph" w:styleId="Normal" w:default="1">
+    <w:name w:val="Normal"/>
+    <w:qFormat/>
+  </w:style>
   <w:style w:type="paragraph" w:styleId="Title">
     <w:name w:val="Title"/>
     <w:basedOn w:val="Normal"/>
@@ -16985,4 +17145,294 @@
     </w:rPr>
   </w:style>
 </w:styles>
+</file>
+
+<file path=word/theme/theme1.xml><?xml version="1.0" encoding="utf-8"?>
+<a:theme xmlns:a="http://schemas.openxmlformats.org/drawingml/2006/main" name="Office Theme">
+  <a:themeElements>
+    <a:clrScheme name="Office">
+      <a:dk1>
+        <a:sysClr val="windowText" lastClr="000000"/>
+      </a:dk1>
+      <a:lt1>
+        <a:sysClr val="window" lastClr="FFFFFF"/>
+      </a:lt1>
+      <a:dk2>
+        <a:srgbClr val="44546A"/>
+      </a:dk2>
+      <a:lt2>
+        <a:srgbClr val="E7E6E6"/>
+      </a:lt2>
+      <a:accent1>
+        <a:srgbClr val="4472C4"/>
+      </a:accent1>
+      <a:accent2>
+        <a:srgbClr val="ED7D31"/>
+      </a:accent2>
+      <a:accent3>
+        <a:srgbClr val="A5A5A5"/>
+      </a:accent3>
+      <a:accent4>
+        <a:srgbClr val="FFC000"/>
+      </a:accent4>
+      <a:accent5>
+        <a:srgbClr val="5B9BD5"/>
+      </a:accent5>
+      <a:accent6>
+        <a:srgbClr val="70AD47"/>
+      </a:accent6>
+      <a:hlink>
+        <a:srgbClr val="0563C1"/>
+      </a:hlink>
+      <a:folHlink>
+        <a:srgbClr val="954F72"/>
+      </a:folHlink>
+    </a:clrScheme>
+    <a:fontScheme name="Office">
+      <a:majorFont>
+        <a:latin typeface="Calibri Light" panose="020F0302020204030204"/>
+        <a:ea typeface=""/>
+        <a:cs typeface=""/>
+        <a:font script="Jpan" typeface="游ゴシック Light"/>
+        <a:font script="Hang" typeface="맑은 고딕"/>
+        <a:font script="Hans" typeface="等线 Light"/>
+        <a:font script="Hant" typeface="新細明體"/>
+        <a:font script="Arab" typeface="Times New Roman"/>
+        <a:font script="Hebr" typeface="Times New Roman"/>
+        <a:font script="Thai" typeface="Angsana New"/>
+        <a:font script="Ethi" typeface="Nyala"/>
+        <a:font script="Beng" typeface="Vrinda"/>
+        <a:font script="Gujr" typeface="Shruti"/>
+        <a:font script="Khmr" typeface="MoolBoran"/>
+        <a:font script="Knda" typeface="Tunga"/>
+        <a:font script="Guru" typeface="Raavi"/>
+        <a:font script="Cans" typeface="Euphemia"/>
+        <a:font script="Cher" typeface="Plantagenet Cherokee"/>
+        <a:font script="Yiii" typeface="Microsoft Yi Baiti"/>
+        <a:font script="Tibt" typeface="Microsoft Himalaya"/>
+        <a:font script="Thaa" typeface="MV Boli"/>
+        <a:font script="Deva" typeface="Mangal"/>
+        <a:font script="Telu" typeface="Gautami"/>
+        <a:font script="Taml" typeface="Latha"/>
+        <a:font script="Syrc" typeface="Estrangelo Edessa"/>
+        <a:font script="Orya" typeface="Kalinga"/>
+        <a:font script="Mlym" typeface="Kartika"/>
+        <a:font script="Laoo" typeface="DokChampa"/>
+        <a:font script="Sinh" typeface="Iskoola Pota"/>
+        <a:font script="Mong" typeface="Mongolian Baiti"/>
+        <a:font script="Viet" typeface="Times New Roman"/>
+        <a:font script="Uigh" typeface="Microsoft Uighur"/>
+        <a:font script="Geor" typeface="Sylfaen"/>
+        <a:font script="Armn" typeface="Arial"/>
+        <a:font script="Bugi" typeface="Leelawadee UI"/>
+        <a:font script="Bopo" typeface="Microsoft JhengHei"/>
+        <a:font script="Java" typeface="Javanese Text"/>
+        <a:font script="Lisu" typeface="Segoe UI"/>
+        <a:font script="Mymr" typeface="Myanmar Text"/>
+        <a:font script="Nkoo" typeface="Ebrima"/>
+        <a:font script="Olck" typeface="Nirmala UI"/>
+        <a:font script="Osma" typeface="Ebrima"/>
+        <a:font script="Phag" typeface="Phagspa"/>
+        <a:font script="Syrn" typeface="Estrangelo Edessa"/>
+        <a:font script="Syrj" typeface="Estrangelo Edessa"/>
+        <a:font script="Syre" typeface="Estrangelo Edessa"/>
+        <a:font script="Sora" typeface="Nirmala UI"/>
+        <a:font script="Tale" typeface="Microsoft Tai Le"/>
+        <a:font script="Talu" typeface="Microsoft New Tai Lue"/>
+        <a:font script="Tfng" typeface="Ebrima"/>
+      </a:majorFont>
+      <a:minorFont>
+        <a:latin typeface="Calibri" panose="020F0502020204030204"/>
+        <a:ea typeface=""/>
+        <a:cs typeface=""/>
+        <a:font script="Jpan" typeface="游明朝"/>
+        <a:font script="Hang" typeface="맑은 고딕"/>
+        <a:font script="Hans" typeface="等线"/>
+        <a:font script="Hant" typeface="新細明體"/>
+        <a:font script="Arab" typeface="Arial"/>
+        <a:font script="Hebr" typeface="Arial"/>
+        <a:font script="Thai" typeface="Cordia New"/>
+        <a:font script="Ethi" typeface="Nyala"/>
+        <a:font script="Beng" typeface="Vrinda"/>
+        <a:font script="Gujr" typeface="Shruti"/>
+        <a:font script="Khmr" typeface="DaunPenh"/>
+        <a:font script="Knda" typeface="Tunga"/>
+        <a:font script="Guru" typeface="Raavi"/>
+        <a:font script="Cans" typeface="Euphemia"/>
+        <a:font script="Cher" typeface="Plantagenet Cherokee"/>
+        <a:font script="Yiii" typeface="Microsoft Yi Baiti"/>
+        <a:font script="Tibt" typeface="Microsoft Himalaya"/>
+        <a:font script="Thaa" typeface="MV Boli"/>
+        <a:font script="Deva" typeface="Mangal"/>
+        <a:font script="Telu" typeface="Gautami"/>
+        <a:font script="Taml" typeface="Latha"/>
+        <a:font script="Syrc" typeface="Estrangelo Edessa"/>
+        <a:font script="Orya" typeface="Kalinga"/>
+        <a:font script="Mlym" typeface="Kartika"/>
+        <a:font script="Laoo" typeface="DokChampa"/>
+        <a:font script="Sinh" typeface="Iskoola Pota"/>
+        <a:font script="Mong" typeface="Mongolian Baiti"/>
+        <a:font script="Viet" typeface="Arial"/>
+        <a:font script="Uigh" typeface="Microsoft Uighur"/>
+        <a:font script="Geor" typeface="Sylfaen"/>
+        <a:font script="Armn" typeface="Arial"/>
+        <a:font script="Bugi" typeface="Leelawadee UI"/>
+        <a:font script="Bopo" typeface="Microsoft JhengHei"/>
+        <a:font script="Java" typeface="Javanese Text"/>
+        <a:font script="Lisu" typeface="Segoe UI"/>
+        <a:font script="Mymr" typeface="Myanmar Text"/>
+        <a:font script="Nkoo" typeface="Ebrima"/>
+        <a:font script="Olck" typeface="Nirmala UI"/>
+        <a:font script="Osma" typeface="Ebrima"/>
+        <a:font script="Phag" typeface="Phagspa"/>
+        <a:font script="Syrn" typeface="Estrangelo Edessa"/>
+        <a:font script="Syrj" typeface="Estrangelo Edessa"/>
+        <a:font script="Syre" typeface="Estrangelo Edessa"/>
+        <a:font script="Sora" typeface="Nirmala UI"/>
+        <a:font script="Tale" typeface="Microsoft Tai Le"/>
+        <a:font script="Talu" typeface="Microsoft New Tai Lue"/>
+        <a:font script="Tfng" typeface="Ebrima"/>
+      </a:minorFont>
+    </a:fontScheme>
+    <a:fmtScheme name="Office">
+      <a:fillStyleLst>
+        <a:solidFill>
+          <a:schemeClr val="phClr"/>
+        </a:solidFill>
+        <a:gradFill rotWithShape="true">
+          <a:gsLst>
+            <a:gs pos="0">
+              <a:schemeClr val="phClr">
+                <a:lumMod val="110000"/>
+                <a:satMod val="105000"/>
+                <a:tint val="67000"/>
+              </a:schemeClr>
+            </a:gs>
+            <a:gs pos="50000">
+              <a:schemeClr val="phClr">
+                <a:lumMod val="105000"/>
+                <a:satMod val="103000"/>
+                <a:tint val="73000"/>
+              </a:schemeClr>
+            </a:gs>
+            <a:gs pos="100000">
+              <a:schemeClr val="phClr">
+                <a:lumMod val="105000"/>
+                <a:satMod val="109000"/>
+                <a:tint val="81000"/>
+              </a:schemeClr>
+            </a:gs>
+          </a:gsLst>
+          <a:lin ang="5400000" scaled="false"/>
+        </a:gradFill>
+        <a:gradFill rotWithShape="true">
+          <a:gsLst>
+            <a:gs pos="0">
+              <a:schemeClr val="phClr">
+                <a:satMod val="103000"/>
+                <a:lumMod val="102000"/>
+                <a:tint val="94000"/>
+              </a:schemeClr>
+            </a:gs>
+            <a:gs pos="50000">
+              <a:schemeClr val="phClr">
+                <a:satMod val="110000"/>
+                <a:lumMod val="100000"/>
+                <a:shade val="100000"/>
+              </a:schemeClr>
+            </a:gs>
+            <a:gs pos="100000">
+              <a:schemeClr val="phClr">
+                <a:lumMod val="99000"/>
+                <a:satMod val="120000"/>
+                <a:shade val="78000"/>
+              </a:schemeClr>
+            </a:gs>
+          </a:gsLst>
+          <a:lin ang="5400000" scaled="false"/>
+        </a:gradFill>
+      </a:fillStyleLst>
+      <a:lnStyleLst>
+        <a:ln w="6350" cap="flat" cmpd="sng" algn="ctr">
+          <a:solidFill>
+            <a:schemeClr val="phClr"/>
+          </a:solidFill>
+          <a:prstDash val="solid"/>
+          <a:miter lim="800000"/>
+        </a:ln>
+        <a:ln w="12700" cap="flat" cmpd="sng" algn="ctr">
+          <a:solidFill>
+            <a:schemeClr val="phClr"/>
+          </a:solidFill>
+          <a:prstDash val="solid"/>
+          <a:miter lim="800000"/>
+        </a:ln>
+        <a:ln w="19050" cap="flat" cmpd="sng" algn="ctr">
+          <a:solidFill>
+            <a:schemeClr val="phClr"/>
+          </a:solidFill>
+          <a:prstDash val="solid"/>
+          <a:miter lim="800000"/>
+        </a:ln>
+      </a:lnStyleLst>
+      <a:effectStyleLst>
+        <a:effectStyle>
+          <a:effectLst/>
+        </a:effectStyle>
+        <a:effectStyle>
+          <a:effectLst/>
+        </a:effectStyle>
+        <a:effectStyle>
+          <a:effectLst>
+            <a:outerShdw blurRad="57150" dist="19050" dir="5400000" algn="ctr" rotWithShape="false">
+              <a:srgbClr val="000000">
+                <a:alpha val="63000"/>
+              </a:srgbClr>
+            </a:outerShdw>
+          </a:effectLst>
+        </a:effectStyle>
+      </a:effectStyleLst>
+      <a:bgFillStyleLst>
+        <a:solidFill>
+          <a:schemeClr val="phClr"/>
+        </a:solidFill>
+        <a:solidFill>
+          <a:schemeClr val="phClr">
+            <a:tint val="95000"/>
+            <a:satMod val="170000"/>
+          </a:schemeClr>
+        </a:solidFill>
+        <a:gradFill rotWithShape="true">
+          <a:gsLst>
+            <a:gs pos="0">
+              <a:schemeClr val="phClr">
+                <a:tint val="93000"/>
+                <a:satMod val="150000"/>
+                <a:shade val="98000"/>
+                <a:lumMod val="102000"/>
+              </a:schemeClr>
+            </a:gs>
+            <a:gs pos="50000">
+              <a:schemeClr val="phClr">
+                <a:tint val="98000"/>
+                <a:satMod val="130000"/>
+                <a:shade val="90000"/>
+                <a:lumMod val="103000"/>
+              </a:schemeClr>
+            </a:gs>
+            <a:gs pos="100000">
+              <a:schemeClr val="phClr">
+                <a:shade val="63000"/>
+                <a:satMod val="120000"/>
+              </a:schemeClr>
+            </a:gs>
+          </a:gsLst>
+          <a:lin ang="5400000" scaled="false"/>
+        </a:gradFill>
+      </a:bgFillStyleLst>
+    </a:fmtScheme>
+  </a:themeElements>
+  <a:objectDefaults/>
+  <a:extraClrSchemeLst/>
+</a:theme>
 </file>
</xml_diff>